<commit_message>
vault backup: 2026-04-15 14:51:52
</commit_message>
<xml_diff>
--- a/Datenbanksysteme/Übung/UE04/UE04_1.docx
+++ b/Datenbanksysteme/Übung/UE04/UE04_1.docx
@@ -5,64 +5,623 @@
     <w:p>
       <w:pPr>
         <w:rPr>
-          <w:lang w:val="de-AT"/>
-        </w:rPr>
-      </w:pPr>
-      <w:r>
-        <w:rPr>
-          <w:lang w:val="de-AT"/>
-        </w:rPr>
-        <w:t>Person: {[</w:t>
-      </w:r>
-      <w:r>
-        <w:rPr>
-          <w:u w:val="single"/>
-          <w:lang w:val="de-AT"/>
-        </w:rPr>
-        <w:t>PersNr:Number</w:t>
-      </w:r>
-      <w:r>
-        <w:rPr>
-          <w:lang w:val="de-AT"/>
-        </w:rPr>
-        <w:t>, Name:String, Geburtsdatum:Date]}</w:t>
-      </w:r>
+          <w:sz w:val="20"/>
+          <w:szCs w:val="20"/>
+          <w:lang w:val="de-AT"/>
+        </w:rPr>
+      </w:pPr>
     </w:p>
     <w:p>
       <w:pPr>
-        <w:rPr>
-          <w:lang w:val="de-AT"/>
-        </w:rPr>
-      </w:pPr>
-      <w:r>
-        <w:rPr>
-          <w:lang w:val="de-AT"/>
-        </w:rPr>
-        <w:t>// Person_is_a //Note: wird nicht benötigt, Referenzierung über Schlüssel</w:t>
+        <w:pStyle w:val="Listenabsatz"/>
+        <w:numPr>
+          <w:ilvl w:val="0"/>
+          <w:numId w:val="1"/>
+        </w:numPr>
+        <w:rPr>
+          <w:sz w:val="20"/>
+          <w:szCs w:val="20"/>
+          <w:lang w:val="de-AT"/>
+        </w:rPr>
+      </w:pPr>
+      <w:r>
+        <w:rPr>
+          <w:sz w:val="20"/>
+          <w:szCs w:val="20"/>
+          <w:lang w:val="de-AT"/>
+        </w:rPr>
+        <w:t>Laborverwaltung</w:t>
       </w:r>
     </w:p>
     <w:p>
-      <w:r>
+      <w:pPr>
+        <w:rPr>
+          <w:sz w:val="20"/>
+          <w:szCs w:val="20"/>
+          <w:lang w:val="de-AT"/>
+        </w:rPr>
+      </w:pPr>
+      <w:r>
+        <w:rPr>
+          <w:sz w:val="20"/>
+          <w:szCs w:val="20"/>
+          <w:lang w:val="de-AT"/>
+        </w:rPr>
+        <w:t>Person: {[</w:t>
+      </w:r>
+      <w:r>
+        <w:rPr>
+          <w:sz w:val="20"/>
+          <w:szCs w:val="20"/>
+          <w:u w:val="single"/>
+          <w:lang w:val="de-AT"/>
+        </w:rPr>
+        <w:t>PersNr:Number</w:t>
+      </w:r>
+      <w:r>
+        <w:rPr>
+          <w:sz w:val="20"/>
+          <w:szCs w:val="20"/>
+          <w:lang w:val="de-AT"/>
+        </w:rPr>
+        <w:t>, Name:String, Geburtsdatum:Date]}</w:t>
+      </w:r>
+    </w:p>
+    <w:p>
+      <w:pPr>
+        <w:rPr>
+          <w:sz w:val="20"/>
+          <w:szCs w:val="20"/>
+          <w:lang w:val="de-AT"/>
+        </w:rPr>
+      </w:pPr>
+      <w:r>
+        <w:rPr>
+          <w:sz w:val="20"/>
+          <w:szCs w:val="20"/>
+          <w:lang w:val="de-AT"/>
+        </w:rPr>
         <w:t>Administrator:  {[</w:t>
       </w:r>
       <w:r>
         <w:rPr>
+          <w:sz w:val="20"/>
+          <w:szCs w:val="20"/>
           <w:u w:val="double"/>
+          <w:lang w:val="de-AT"/>
         </w:rPr>
         <w:t>PersNr:Number</w:t>
       </w:r>
       <w:r>
-        <w:t>, Name:String, Geburtsdatum:Date]}</w:t>
-      </w:r>
+        <w:rPr>
+          <w:sz w:val="20"/>
+          <w:szCs w:val="20"/>
+          <w:lang w:val="de-AT"/>
+        </w:rPr>
+        <w:t>,</w:t>
+      </w:r>
+      <w:r>
+        <w:rPr>
+          <w:sz w:val="20"/>
+          <w:szCs w:val="20"/>
+          <w:lang w:val="de-AT"/>
+        </w:rPr>
+        <w:t xml:space="preserve"> Gehalt:Number</w:t>
+      </w:r>
+      <w:r>
+        <w:rPr>
+          <w:sz w:val="20"/>
+          <w:szCs w:val="20"/>
+          <w:lang w:val="de-AT"/>
+        </w:rPr>
+        <w:t xml:space="preserve">, </w:t>
+      </w:r>
+      <w:r>
+        <w:rPr>
+          <w:sz w:val="20"/>
+          <w:szCs w:val="20"/>
+          <w:lang w:val="de-AT"/>
+        </w:rPr>
+        <w:t>Arbeitsbeginn</w:t>
+      </w:r>
+      <w:r>
+        <w:rPr>
+          <w:sz w:val="20"/>
+          <w:szCs w:val="20"/>
+          <w:lang w:val="de-AT"/>
+        </w:rPr>
+        <w:t>:Date]}</w:t>
+      </w:r>
+    </w:p>
+    <w:p>
+      <w:pPr>
+        <w:rPr>
+          <w:sz w:val="20"/>
+          <w:szCs w:val="20"/>
+          <w:lang w:val="de-AT"/>
+        </w:rPr>
+      </w:pPr>
+      <w:r>
+        <w:rPr>
+          <w:sz w:val="20"/>
+          <w:szCs w:val="20"/>
+          <w:lang w:val="de-AT"/>
+        </w:rPr>
+        <w:t>Student: {[</w:t>
+      </w:r>
+      <w:r>
+        <w:rPr>
+          <w:sz w:val="20"/>
+          <w:szCs w:val="20"/>
+          <w:u w:val="double"/>
+          <w:lang w:val="de-AT"/>
+        </w:rPr>
+        <w:t xml:space="preserve"> PersNr:Number,</w:t>
+      </w:r>
+      <w:r>
+        <w:rPr>
+          <w:sz w:val="20"/>
+          <w:szCs w:val="20"/>
+          <w:lang w:val="de-AT"/>
+        </w:rPr>
+        <w:t xml:space="preserve"> Studiengang:String, Semester:Number]}</w:t>
+      </w:r>
+    </w:p>
+    <w:p>
+      <w:pPr>
+        <w:rPr>
+          <w:color w:val="ADADAD" w:themeColor="background2" w:themeShade="BF"/>
+          <w:sz w:val="20"/>
+          <w:szCs w:val="20"/>
+          <w:lang w:val="de-AT"/>
+        </w:rPr>
+      </w:pPr>
+      <w:r>
+        <w:rPr>
+          <w:sz w:val="20"/>
+          <w:szCs w:val="20"/>
+          <w:lang w:val="de-AT"/>
+        </w:rPr>
+        <w:t>benutzt: {[</w:t>
+      </w:r>
+      <w:r>
+        <w:rPr>
+          <w:sz w:val="20"/>
+          <w:szCs w:val="20"/>
+          <w:u w:val="double"/>
+          <w:lang w:val="de-AT"/>
+        </w:rPr>
+        <w:t>StudentPersNr:Number, LaborId:Number</w:t>
+      </w:r>
+      <w:r>
+        <w:rPr>
+          <w:sz w:val="20"/>
+          <w:szCs w:val="20"/>
+          <w:lang w:val="de-AT"/>
+        </w:rPr>
+        <w:t xml:space="preserve">, </w:t>
+      </w:r>
+      <w:r>
+        <w:rPr>
+          <w:sz w:val="20"/>
+          <w:szCs w:val="20"/>
+          <w:u w:val="single"/>
+          <w:lang w:val="de-AT"/>
+        </w:rPr>
+        <w:t>Nutzungsbeginn:Number</w:t>
+      </w:r>
+      <w:r>
+        <w:rPr>
+          <w:sz w:val="20"/>
+          <w:szCs w:val="20"/>
+          <w:lang w:val="de-AT"/>
+        </w:rPr>
+        <w:t>,</w:t>
+      </w:r>
+      <w:r>
+        <w:rPr>
+          <w:sz w:val="20"/>
+          <w:szCs w:val="20"/>
+          <w:lang w:val="de-AT"/>
+        </w:rPr>
+        <w:t xml:space="preserve"> </w:t>
+      </w:r>
+      <w:r>
+        <w:rPr>
+          <w:sz w:val="20"/>
+          <w:szCs w:val="20"/>
+          <w:lang w:val="de-AT"/>
+        </w:rPr>
+        <w:t>Nutzungsende:Number]} //</w:t>
+      </w:r>
+      <w:r>
+        <w:rPr>
+          <w:color w:val="ADADAD" w:themeColor="background2" w:themeShade="BF"/>
+          <w:sz w:val="20"/>
+          <w:szCs w:val="20"/>
+          <w:lang w:val="de-AT"/>
+        </w:rPr>
+        <w:t>Fremd- und Primärschlüssel – für die eindeutige Session noch den Nutzungsbeginn</w:t>
+      </w:r>
+    </w:p>
+    <w:p>
+      <w:pPr>
+        <w:rPr>
+          <w:sz w:val="20"/>
+          <w:szCs w:val="20"/>
+          <w:lang w:val="de-AT"/>
+        </w:rPr>
+      </w:pPr>
+      <w:r>
+        <w:rPr>
+          <w:sz w:val="20"/>
+          <w:szCs w:val="20"/>
+          <w:lang w:val="de-AT"/>
+        </w:rPr>
+        <w:t>zuständig: {[</w:t>
+      </w:r>
+      <w:r>
+        <w:rPr>
+          <w:sz w:val="20"/>
+          <w:szCs w:val="20"/>
+          <w:lang w:val="de-AT"/>
+        </w:rPr>
+        <w:t xml:space="preserve"> </w:t>
+      </w:r>
+      <w:r>
+        <w:rPr>
+          <w:sz w:val="20"/>
+          <w:szCs w:val="20"/>
+          <w:u w:val="double"/>
+          <w:lang w:val="de-AT"/>
+        </w:rPr>
+        <w:t>LaborId:Number</w:t>
+      </w:r>
+      <w:r>
+        <w:rPr>
+          <w:sz w:val="20"/>
+          <w:szCs w:val="20"/>
+          <w:lang w:val="de-AT"/>
+        </w:rPr>
+        <w:t xml:space="preserve">, </w:t>
+      </w:r>
+      <w:r>
+        <w:rPr>
+          <w:sz w:val="20"/>
+          <w:szCs w:val="20"/>
+          <w:u w:val="dash"/>
+          <w:lang w:val="de-AT"/>
+        </w:rPr>
+        <w:t>AdminPersNr:Number</w:t>
+      </w:r>
+      <w:r>
+        <w:rPr>
+          <w:sz w:val="20"/>
+          <w:szCs w:val="20"/>
+          <w:lang w:val="de-AT"/>
+        </w:rPr>
+        <w:t>]}</w:t>
+      </w:r>
+      <w:r>
+        <w:rPr>
+          <w:sz w:val="20"/>
+          <w:szCs w:val="20"/>
+          <w:lang w:val="de-AT"/>
+        </w:rPr>
+        <w:t xml:space="preserve"> // </w:t>
+      </w:r>
+      <w:r>
+        <w:rPr>
+          <w:color w:val="ADADAD" w:themeColor="background2" w:themeShade="BF"/>
+          <w:sz w:val="20"/>
+          <w:szCs w:val="20"/>
+          <w:lang w:val="de-AT"/>
+        </w:rPr>
+        <w:t>Note: Diese Tabelle ist nur notwendig, wenn (so wie im Diagramm angegeben) ein Labor keinen oder einen Administrator haben kann. Dann gilt: 2</w:t>
+      </w:r>
+      <w:r>
+        <w:rPr>
+          <w:color w:val="ADADAD" w:themeColor="background2" w:themeShade="BF"/>
+          <w:sz w:val="20"/>
+          <w:szCs w:val="20"/>
+          <w:lang w:val="de-AT"/>
+        </w:rPr>
+        <w:t xml:space="preserve"> Fremdschlüsseln, LaborId ist auch Primärschlüssel, weil ein Labor genau einen Admin hat, </w:t>
+      </w:r>
+      <w:r>
+        <w:rPr>
+          <w:color w:val="ADADAD" w:themeColor="background2" w:themeShade="BF"/>
+          <w:sz w:val="20"/>
+          <w:szCs w:val="20"/>
+          <w:lang w:val="de-AT"/>
+        </w:rPr>
+        <w:t xml:space="preserve">wenn </w:t>
+      </w:r>
+      <w:r>
+        <w:rPr>
+          <w:color w:val="ADADAD" w:themeColor="background2" w:themeShade="BF"/>
+          <w:sz w:val="20"/>
+          <w:szCs w:val="20"/>
+          <w:lang w:val="de-AT"/>
+        </w:rPr>
+        <w:t>es einen Eintrag in dieser Tabelle dafür gibt</w:t>
+      </w:r>
+      <w:r>
+        <w:rPr>
+          <w:color w:val="ADADAD" w:themeColor="background2" w:themeShade="BF"/>
+          <w:sz w:val="20"/>
+          <w:szCs w:val="20"/>
+          <w:lang w:val="de-AT"/>
+        </w:rPr>
+        <w:t>.</w:t>
+      </w:r>
+      <w:r>
+        <w:rPr>
+          <w:color w:val="ADADAD" w:themeColor="background2" w:themeShade="BF"/>
+          <w:sz w:val="20"/>
+          <w:szCs w:val="20"/>
+          <w:lang w:val="de-AT"/>
+        </w:rPr>
+        <w:br/>
+        <w:t>Wenn gilt, dass ein Labor genau einen Administrator hat (so wie oben in der Beschreibung angegeben), dann ist die Tabelle überflüssig und bei Labor kann die PersNr des zugehörigen Administrators als Fremdschlüssel gespeichert werden.</w:t>
+      </w:r>
+    </w:p>
+    <w:p>
+      <w:pPr>
+        <w:rPr>
+          <w:sz w:val="20"/>
+          <w:szCs w:val="20"/>
+          <w:lang w:val="en-US"/>
+        </w:rPr>
+      </w:pPr>
+      <w:r>
+        <w:rPr>
+          <w:sz w:val="20"/>
+          <w:szCs w:val="20"/>
+          <w:lang w:val="en-US"/>
+        </w:rPr>
+        <w:t>Labor: {[</w:t>
+      </w:r>
+      <w:r>
+        <w:rPr>
+          <w:sz w:val="20"/>
+          <w:szCs w:val="20"/>
+          <w:u w:val="single"/>
+          <w:lang w:val="en-US"/>
+        </w:rPr>
+        <w:t>LaborId:Number</w:t>
+      </w:r>
+      <w:r>
+        <w:rPr>
+          <w:sz w:val="20"/>
+          <w:szCs w:val="20"/>
+          <w:lang w:val="en-US"/>
+        </w:rPr>
+        <w:t>, Sitzplätze:Number, Typ:String,]}</w:t>
+      </w:r>
+    </w:p>
+    <w:p>
+      <w:pPr>
+        <w:rPr>
+          <w:sz w:val="20"/>
+          <w:szCs w:val="20"/>
+          <w:lang w:val="de-AT"/>
+        </w:rPr>
+      </w:pPr>
+      <w:r>
+        <w:rPr>
+          <w:sz w:val="20"/>
+          <w:szCs w:val="20"/>
+          <w:lang w:val="de-AT"/>
+        </w:rPr>
+        <w:t>Hardware: {[</w:t>
+      </w:r>
+      <w:r>
+        <w:rPr>
+          <w:sz w:val="20"/>
+          <w:szCs w:val="20"/>
+          <w:u w:val="single"/>
+          <w:lang w:val="de-AT"/>
+        </w:rPr>
+        <w:t>HardwareId:Number</w:t>
+      </w:r>
+      <w:r>
+        <w:rPr>
+          <w:sz w:val="20"/>
+          <w:szCs w:val="20"/>
+          <w:lang w:val="de-AT"/>
+        </w:rPr>
+        <w:t xml:space="preserve">, Bezeichnung:String, Kaufpreis:Number, Kaufdatum:Date, </w:t>
+      </w:r>
+      <w:r>
+        <w:rPr>
+          <w:sz w:val="20"/>
+          <w:szCs w:val="20"/>
+          <w:u w:val="dash"/>
+          <w:lang w:val="de-AT"/>
+        </w:rPr>
+        <w:t>LaborId:Number</w:t>
+      </w:r>
+      <w:r>
+        <w:rPr>
+          <w:sz w:val="20"/>
+          <w:szCs w:val="20"/>
+          <w:lang w:val="de-AT"/>
+        </w:rPr>
+        <w:t>]}</w:t>
+      </w:r>
+    </w:p>
+    <w:p>
+      <w:pPr>
+        <w:rPr>
+          <w:sz w:val="20"/>
+          <w:szCs w:val="20"/>
+          <w:lang w:val="de-AT"/>
+        </w:rPr>
+      </w:pPr>
+    </w:p>
+    <w:p>
+      <w:pPr>
+        <w:pStyle w:val="Listenabsatz"/>
+        <w:numPr>
+          <w:ilvl w:val="0"/>
+          <w:numId w:val="1"/>
+        </w:numPr>
+        <w:rPr>
+          <w:sz w:val="20"/>
+          <w:szCs w:val="20"/>
+          <w:lang w:val="de-AT"/>
+        </w:rPr>
+      </w:pPr>
+      <w:r>
+        <w:rPr>
+          <w:sz w:val="20"/>
+          <w:szCs w:val="20"/>
+          <w:lang w:val="de-AT"/>
+        </w:rPr>
+        <w:t>Relationales Modell</w:t>
+      </w:r>
+    </w:p>
+    <w:p>
+      <w:pPr>
+        <w:rPr>
+          <w:sz w:val="20"/>
+          <w:szCs w:val="20"/>
+          <w:lang w:val="de-AT"/>
+        </w:rPr>
+      </w:pPr>
+      <w:r>
+        <w:rPr>
+          <w:sz w:val="20"/>
+          <w:szCs w:val="20"/>
+          <w:lang w:val="de-AT"/>
+        </w:rPr>
+        <w:t>Name {[ ]}</w:t>
+      </w:r>
+    </w:p>
+    <w:p>
+      <w:pPr>
+        <w:rPr>
+          <w:sz w:val="20"/>
+          <w:szCs w:val="20"/>
+          <w:lang w:val="de-AT"/>
+        </w:rPr>
+      </w:pPr>
+    </w:p>
+    <w:p>
+      <w:pPr>
+        <w:rPr>
+          <w:sz w:val="20"/>
+          <w:szCs w:val="20"/>
+          <w:lang w:val="de-AT"/>
+        </w:rPr>
+      </w:pPr>
     </w:p>
     <w:sectPr>
       <w:pgSz w:w="11906" w:h="16838"/>
-      <w:pgMar w:top="1440" w:right="1440" w:bottom="1440" w:left="1440" w:header="708" w:footer="708" w:gutter="0"/>
+      <w:pgMar w:top="1440" w:right="707" w:bottom="1440" w:left="567" w:header="708" w:footer="708" w:gutter="0"/>
       <w:cols w:space="708"/>
       <w:docGrid w:linePitch="360"/>
     </w:sectPr>
   </w:body>
 </w:document>
+</file>
+
+<file path=word/numbering.xml><?xml version="1.0" encoding="utf-8"?>
+<w:numbering xmlns:wpc="http://schemas.microsoft.com/office/word/2010/wordprocessingCanvas" xmlns:cx="http://schemas.microsoft.com/office/drawing/2014/chartex" xmlns:cx1="http://schemas.microsoft.com/office/drawing/2015/9/8/chartex" xmlns:cx2="http://schemas.microsoft.com/office/drawing/2015/10/21/chartex" xmlns:cx3="http://schemas.microsoft.com/office/drawing/2016/5/9/chartex" xmlns:cx4="http://schemas.microsoft.com/office/drawing/2016/5/10/chartex" xmlns:cx5="http://schemas.microsoft.com/office/drawing/2016/5/11/chartex" xmlns:cx6="http://schemas.microsoft.com/office/drawing/2016/5/12/chartex" xmlns:cx7="http://schemas.microsoft.com/office/drawing/2016/5/13/chartex" xmlns:cx8="http://schemas.microsoft.com/office/drawing/2016/5/14/chartex" xmlns:mc="http://schemas.openxmlformats.org/markup-compatibility/2006" xmlns:aink="http://schemas.microsoft.com/office/drawing/2016/ink" xmlns:am3d="http://schemas.microsoft.com/office/drawing/2017/model3d" xmlns:o="urn:schemas-microsoft-com:office:office" xmlns:oel="http://schemas.microsoft.com/office/2019/extlst" xmlns:r="http://schemas.openxmlformats.org/officeDocument/2006/relationships" xmlns:m="http://schemas.openxmlformats.org/officeDocument/2006/math" xmlns:v="urn:schemas-microsoft-com:vml" xmlns:wp14="http://schemas.microsoft.com/office/word/2010/wordprocessingDrawing" xmlns:wp="http://schemas.openxmlformats.org/drawingml/2006/wordprocessingDrawing" xmlns:w10="urn:schemas-microsoft-com:office:word" xmlns:w="http://schemas.openxmlformats.org/wordprocessingml/2006/main" xmlns:w14="http://schemas.microsoft.com/office/word/2010/wordml" xmlns:w15="http://schemas.microsoft.com/office/word/2012/wordml" xmlns:w16cex="http://schemas.microsoft.com/office/word/2018/wordml/cex" xmlns:w16cid="http://schemas.microsoft.com/office/word/2016/wordml/cid" xmlns:w16="http://schemas.microsoft.com/office/word/2018/wordml" xmlns:w16du="http://schemas.microsoft.com/office/word/2023/wordml/word16du" xmlns:w16sdtdh="http://schemas.microsoft.com/office/word/2020/wordml/sdtdatahash" xmlns:w16sdtfl="http://schemas.microsoft.com/office/word/2024/wordml/sdtformatlock" xmlns:w16se="http://schemas.microsoft.com/office/word/2015/wordml/symex" xmlns:wpg="http://schemas.microsoft.com/office/word/2010/wordprocessingGroup" xmlns:wpi="http://schemas.microsoft.com/office/word/2010/wordprocessingInk" xmlns:wne="http://schemas.microsoft.com/office/word/2006/wordml" xmlns:wps="http://schemas.microsoft.com/office/word/2010/wordprocessingShape" mc:Ignorable="w14 w15 w16se w16cid w16 w16cex w16sdtdh w16sdtfl w16du wp14">
+  <w:abstractNum w:abstractNumId="0" w15:restartNumberingAfterBreak="0">
+    <w:nsid w:val="626A512B"/>
+    <w:multiLevelType w:val="hybridMultilevel"/>
+    <w:tmpl w:val="2308509C"/>
+    <w:lvl w:ilvl="0" w:tplc="67E64810">
+      <w:start w:val="1"/>
+      <w:numFmt w:val="decimal"/>
+      <w:lvlText w:val="%1.)"/>
+      <w:lvlJc w:val="left"/>
+      <w:pPr>
+        <w:ind w:left="720" w:hanging="360"/>
+      </w:pPr>
+      <w:rPr>
+        <w:rFonts w:hint="default"/>
+      </w:rPr>
+    </w:lvl>
+    <w:lvl w:ilvl="1" w:tplc="20000019" w:tentative="1">
+      <w:start w:val="1"/>
+      <w:numFmt w:val="lowerLetter"/>
+      <w:lvlText w:val="%2."/>
+      <w:lvlJc w:val="left"/>
+      <w:pPr>
+        <w:ind w:left="1440" w:hanging="360"/>
+      </w:pPr>
+    </w:lvl>
+    <w:lvl w:ilvl="2" w:tplc="2000001B" w:tentative="1">
+      <w:start w:val="1"/>
+      <w:numFmt w:val="lowerRoman"/>
+      <w:lvlText w:val="%3."/>
+      <w:lvlJc w:val="right"/>
+      <w:pPr>
+        <w:ind w:left="2160" w:hanging="180"/>
+      </w:pPr>
+    </w:lvl>
+    <w:lvl w:ilvl="3" w:tplc="2000000F" w:tentative="1">
+      <w:start w:val="1"/>
+      <w:numFmt w:val="decimal"/>
+      <w:lvlText w:val="%4."/>
+      <w:lvlJc w:val="left"/>
+      <w:pPr>
+        <w:ind w:left="2880" w:hanging="360"/>
+      </w:pPr>
+    </w:lvl>
+    <w:lvl w:ilvl="4" w:tplc="20000019" w:tentative="1">
+      <w:start w:val="1"/>
+      <w:numFmt w:val="lowerLetter"/>
+      <w:lvlText w:val="%5."/>
+      <w:lvlJc w:val="left"/>
+      <w:pPr>
+        <w:ind w:left="3600" w:hanging="360"/>
+      </w:pPr>
+    </w:lvl>
+    <w:lvl w:ilvl="5" w:tplc="2000001B" w:tentative="1">
+      <w:start w:val="1"/>
+      <w:numFmt w:val="lowerRoman"/>
+      <w:lvlText w:val="%6."/>
+      <w:lvlJc w:val="right"/>
+      <w:pPr>
+        <w:ind w:left="4320" w:hanging="180"/>
+      </w:pPr>
+    </w:lvl>
+    <w:lvl w:ilvl="6" w:tplc="2000000F" w:tentative="1">
+      <w:start w:val="1"/>
+      <w:numFmt w:val="decimal"/>
+      <w:lvlText w:val="%7."/>
+      <w:lvlJc w:val="left"/>
+      <w:pPr>
+        <w:ind w:left="5040" w:hanging="360"/>
+      </w:pPr>
+    </w:lvl>
+    <w:lvl w:ilvl="7" w:tplc="20000019" w:tentative="1">
+      <w:start w:val="1"/>
+      <w:numFmt w:val="lowerLetter"/>
+      <w:lvlText w:val="%8."/>
+      <w:lvlJc w:val="left"/>
+      <w:pPr>
+        <w:ind w:left="5760" w:hanging="360"/>
+      </w:pPr>
+    </w:lvl>
+    <w:lvl w:ilvl="8" w:tplc="2000001B" w:tentative="1">
+      <w:start w:val="1"/>
+      <w:numFmt w:val="lowerRoman"/>
+      <w:lvlText w:val="%9."/>
+      <w:lvlJc w:val="right"/>
+      <w:pPr>
+        <w:ind w:left="6480" w:hanging="180"/>
+      </w:pPr>
+    </w:lvl>
+  </w:abstractNum>
+  <w:num w:numId="1" w16cid:durableId="1106540940">
+    <w:abstractNumId w:val="0"/>
+  </w:num>
+</w:numbering>
 </file>
 
 <file path=word/styles.xml><?xml version="1.0" encoding="utf-8"?>
@@ -668,6 +1227,7 @@
   <w:style w:type="character" w:default="1" w:styleId="Absatz-Standardschriftart">
     <w:name w:val="Default Paragraph Font"/>
     <w:uiPriority w:val="1"/>
+    <w:semiHidden/>
     <w:unhideWhenUsed/>
   </w:style>
   <w:style w:type="table" w:default="1" w:styleId="NormaleTabelle">

</xml_diff>